<commit_message>
Mejora la legibilidad impresa de las figuras y de las preguntas
- Ninguna letra de figura queda bajo 9 pt impresa
- Las siete preguntas para la profesora quedan juntas

Co-Authored-By: Claude Opus 5.5 <noreply@anthropic.com>
</commit_message>
<xml_diff>
--- a/docs/resumen-para-la-profesora.docx
+++ b/docs/resumen-para-la-profesora.docx
@@ -306,9 +306,8 @@
         <w:pStyle w:val="Ttulo1"/>
         <w:pageBreakBefore/>
       </w:pPr>
-      <w:bookmarkStart w:id="0" w:name="_Toc244191781"/>
-      <w:r>
-        <w:lastRenderedPageBreak/>
+      <w:bookmarkStart w:id="0" w:name="_Toc244192489"/>
+      <w:r>
         <w:t>Cómo leer este documento</w:t>
       </w:r>
       <w:bookmarkEnd w:id="0"/>
@@ -463,7 +462,7 @@
           <w:szCs w:val="22"/>
         </w:rPr>
         <w:alias w:val="Índice"/>
-        <w:id w:val="1704139296"/>
+        <w:id w:val="427934474"/>
         <w:docPartObj>
           <w:docPartGallery w:val="Table of Contents"/>
           <w:docPartUnique/>
@@ -498,7 +497,7 @@
           <w:r>
             <w:fldChar w:fldCharType="separate"/>
           </w:r>
-          <w:hyperlink w:anchor="_Toc244191781" w:history="1">
+          <w:hyperlink w:anchor="_Toc244192489" w:history="1">
             <w:r>
               <w:rPr>
                 <w:rStyle w:val="Hipervnculo"/>
@@ -522,7 +521,7 @@
               <w:rPr>
                 <w:noProof/>
               </w:rPr>
-              <w:instrText xml:space="preserve"> PAGEREF _Toc244191781 \h </w:instrText>
+              <w:instrText xml:space="preserve"> PAGEREF _Toc244192489 \h </w:instrText>
             </w:r>
             <w:r>
               <w:rPr>
@@ -567,7 +566,7 @@
               <w14:ligatures w14:val="standardContextual"/>
             </w:rPr>
           </w:pPr>
-          <w:hyperlink w:anchor="_Toc244191782" w:history="1">
+          <w:hyperlink w:anchor="_Toc244192490" w:history="1">
             <w:r>
               <w:rPr>
                 <w:rStyle w:val="Hipervnculo"/>
@@ -591,7 +590,7 @@
               <w:rPr>
                 <w:noProof/>
               </w:rPr>
-              <w:instrText xml:space="preserve"> PAGEREF _Toc244191782 \h </w:instrText>
+              <w:instrText xml:space="preserve"> PAGEREF _Toc244192490 \h </w:instrText>
             </w:r>
             <w:r>
               <w:rPr>
@@ -636,7 +635,7 @@
               <w14:ligatures w14:val="standardContextual"/>
             </w:rPr>
           </w:pPr>
-          <w:hyperlink w:anchor="_Toc244191783" w:history="1">
+          <w:hyperlink w:anchor="_Toc244192491" w:history="1">
             <w:r>
               <w:rPr>
                 <w:rStyle w:val="Hipervnculo"/>
@@ -660,7 +659,7 @@
               <w:rPr>
                 <w:noProof/>
               </w:rPr>
-              <w:instrText xml:space="preserve"> PAGEREF _Toc244191783 \h </w:instrText>
+              <w:instrText xml:space="preserve"> PAGEREF _Toc244192491 \h </w:instrText>
             </w:r>
             <w:r>
               <w:rPr>
@@ -703,7 +702,7 @@
               <w14:ligatures w14:val="standardContextual"/>
             </w:rPr>
           </w:pPr>
-          <w:hyperlink w:anchor="_Toc244191784" w:history="1">
+          <w:hyperlink w:anchor="_Toc244192492" w:history="1">
             <w:r>
               <w:rPr>
                 <w:rStyle w:val="Hipervnculo"/>
@@ -727,7 +726,7 @@
               <w:rPr>
                 <w:noProof/>
               </w:rPr>
-              <w:instrText xml:space="preserve"> PAGEREF _Toc244191784 \h </w:instrText>
+              <w:instrText xml:space="preserve"> PAGEREF _Toc244192492 \h </w:instrText>
             </w:r>
             <w:r>
               <w:rPr>
@@ -770,7 +769,7 @@
               <w14:ligatures w14:val="standardContextual"/>
             </w:rPr>
           </w:pPr>
-          <w:hyperlink w:anchor="_Toc244191785" w:history="1">
+          <w:hyperlink w:anchor="_Toc244192493" w:history="1">
             <w:r>
               <w:rPr>
                 <w:rStyle w:val="Hipervnculo"/>
@@ -794,7 +793,7 @@
               <w:rPr>
                 <w:noProof/>
               </w:rPr>
-              <w:instrText xml:space="preserve"> PAGEREF _Toc244191785 \h </w:instrText>
+              <w:instrText xml:space="preserve"> PAGEREF _Toc244192493 \h </w:instrText>
             </w:r>
             <w:r>
               <w:rPr>
@@ -839,7 +838,7 @@
               <w14:ligatures w14:val="standardContextual"/>
             </w:rPr>
           </w:pPr>
-          <w:hyperlink w:anchor="_Toc244191786" w:history="1">
+          <w:hyperlink w:anchor="_Toc244192494" w:history="1">
             <w:r>
               <w:rPr>
                 <w:rStyle w:val="Hipervnculo"/>
@@ -863,7 +862,7 @@
               <w:rPr>
                 <w:noProof/>
               </w:rPr>
-              <w:instrText xml:space="preserve"> PAGEREF _Toc244191786 \h </w:instrText>
+              <w:instrText xml:space="preserve"> PAGEREF _Toc244192494 \h </w:instrText>
             </w:r>
             <w:r>
               <w:rPr>
@@ -906,7 +905,7 @@
               <w14:ligatures w14:val="standardContextual"/>
             </w:rPr>
           </w:pPr>
-          <w:hyperlink w:anchor="_Toc244191787" w:history="1">
+          <w:hyperlink w:anchor="_Toc244192495" w:history="1">
             <w:r>
               <w:rPr>
                 <w:rStyle w:val="Hipervnculo"/>
@@ -930,7 +929,7 @@
               <w:rPr>
                 <w:noProof/>
               </w:rPr>
-              <w:instrText xml:space="preserve"> PAGEREF _Toc244191787 \h </w:instrText>
+              <w:instrText xml:space="preserve"> PAGEREF _Toc244192495 \h </w:instrText>
             </w:r>
             <w:r>
               <w:rPr>
@@ -973,7 +972,7 @@
               <w14:ligatures w14:val="standardContextual"/>
             </w:rPr>
           </w:pPr>
-          <w:hyperlink w:anchor="_Toc244191788" w:history="1">
+          <w:hyperlink w:anchor="_Toc244192496" w:history="1">
             <w:r>
               <w:rPr>
                 <w:rStyle w:val="Hipervnculo"/>
@@ -997,7 +996,7 @@
               <w:rPr>
                 <w:noProof/>
               </w:rPr>
-              <w:instrText xml:space="preserve"> PAGEREF _Toc244191788 \h </w:instrText>
+              <w:instrText xml:space="preserve"> PAGEREF _Toc244192496 \h </w:instrText>
             </w:r>
             <w:r>
               <w:rPr>
@@ -1014,7 +1013,7 @@
               <w:rPr>
                 <w:noProof/>
               </w:rPr>
-              <w:t>7</w:t>
+              <w:t>8</w:t>
             </w:r>
             <w:r>
               <w:rPr>
@@ -1040,7 +1039,7 @@
               <w14:ligatures w14:val="standardContextual"/>
             </w:rPr>
           </w:pPr>
-          <w:hyperlink w:anchor="_Toc244191789" w:history="1">
+          <w:hyperlink w:anchor="_Toc244192497" w:history="1">
             <w:r>
               <w:rPr>
                 <w:rStyle w:val="Hipervnculo"/>
@@ -1064,7 +1063,7 @@
               <w:rPr>
                 <w:noProof/>
               </w:rPr>
-              <w:instrText xml:space="preserve"> PAGEREF _Toc244191789 \h </w:instrText>
+              <w:instrText xml:space="preserve"> PAGEREF _Toc244192497 \h </w:instrText>
             </w:r>
             <w:r>
               <w:rPr>
@@ -1109,7 +1108,7 @@
               <w14:ligatures w14:val="standardContextual"/>
             </w:rPr>
           </w:pPr>
-          <w:hyperlink w:anchor="_Toc244191790" w:history="1">
+          <w:hyperlink w:anchor="_Toc244192498" w:history="1">
             <w:r>
               <w:rPr>
                 <w:rStyle w:val="Hipervnculo"/>
@@ -1133,7 +1132,7 @@
               <w:rPr>
                 <w:noProof/>
               </w:rPr>
-              <w:instrText xml:space="preserve"> PAGEREF _Toc244191790 \h </w:instrText>
+              <w:instrText xml:space="preserve"> PAGEREF _Toc244192498 \h </w:instrText>
             </w:r>
             <w:r>
               <w:rPr>
@@ -1176,7 +1175,7 @@
               <w14:ligatures w14:val="standardContextual"/>
             </w:rPr>
           </w:pPr>
-          <w:hyperlink w:anchor="_Toc244191791" w:history="1">
+          <w:hyperlink w:anchor="_Toc244192499" w:history="1">
             <w:r>
               <w:rPr>
                 <w:rStyle w:val="Hipervnculo"/>
@@ -1200,7 +1199,7 @@
               <w:rPr>
                 <w:noProof/>
               </w:rPr>
-              <w:instrText xml:space="preserve"> PAGEREF _Toc244191791 \h </w:instrText>
+              <w:instrText xml:space="preserve"> PAGEREF _Toc244192499 \h </w:instrText>
             </w:r>
             <w:r>
               <w:rPr>
@@ -1243,7 +1242,7 @@
               <w14:ligatures w14:val="standardContextual"/>
             </w:rPr>
           </w:pPr>
-          <w:hyperlink w:anchor="_Toc244191792" w:history="1">
+          <w:hyperlink w:anchor="_Toc244192500" w:history="1">
             <w:r>
               <w:rPr>
                 <w:rStyle w:val="Hipervnculo"/>
@@ -1267,7 +1266,7 @@
               <w:rPr>
                 <w:noProof/>
               </w:rPr>
-              <w:instrText xml:space="preserve"> PAGEREF _Toc244191792 \h </w:instrText>
+              <w:instrText xml:space="preserve"> PAGEREF _Toc244192500 \h </w:instrText>
             </w:r>
             <w:r>
               <w:rPr>
@@ -1310,7 +1309,7 @@
               <w14:ligatures w14:val="standardContextual"/>
             </w:rPr>
           </w:pPr>
-          <w:hyperlink w:anchor="_Toc244191793" w:history="1">
+          <w:hyperlink w:anchor="_Toc244192501" w:history="1">
             <w:r>
               <w:rPr>
                 <w:rStyle w:val="Hipervnculo"/>
@@ -1334,7 +1333,7 @@
               <w:rPr>
                 <w:noProof/>
               </w:rPr>
-              <w:instrText xml:space="preserve"> PAGEREF _Toc244191793 \h </w:instrText>
+              <w:instrText xml:space="preserve"> PAGEREF _Toc244192501 \h </w:instrText>
             </w:r>
             <w:r>
               <w:rPr>
@@ -1351,7 +1350,7 @@
               <w:rPr>
                 <w:noProof/>
               </w:rPr>
-              <w:t>10</w:t>
+              <w:t>11</w:t>
             </w:r>
             <w:r>
               <w:rPr>
@@ -1379,7 +1378,7 @@
               <w14:ligatures w14:val="standardContextual"/>
             </w:rPr>
           </w:pPr>
-          <w:hyperlink w:anchor="_Toc244191794" w:history="1">
+          <w:hyperlink w:anchor="_Toc244192502" w:history="1">
             <w:r>
               <w:rPr>
                 <w:rStyle w:val="Hipervnculo"/>
@@ -1403,7 +1402,7 @@
               <w:rPr>
                 <w:noProof/>
               </w:rPr>
-              <w:instrText xml:space="preserve"> PAGEREF _Toc244191794 \h </w:instrText>
+              <w:instrText xml:space="preserve"> PAGEREF _Toc244192502 \h </w:instrText>
             </w:r>
             <w:r>
               <w:rPr>
@@ -1420,7 +1419,7 @@
               <w:rPr>
                 <w:noProof/>
               </w:rPr>
-              <w:t>13</w:t>
+              <w:t>14</w:t>
             </w:r>
             <w:r>
               <w:rPr>
@@ -1446,7 +1445,7 @@
               <w14:ligatures w14:val="standardContextual"/>
             </w:rPr>
           </w:pPr>
-          <w:hyperlink w:anchor="_Toc244191795" w:history="1">
+          <w:hyperlink w:anchor="_Toc244192503" w:history="1">
             <w:r>
               <w:rPr>
                 <w:rStyle w:val="Hipervnculo"/>
@@ -1470,7 +1469,7 @@
               <w:rPr>
                 <w:noProof/>
               </w:rPr>
-              <w:instrText xml:space="preserve"> PAGEREF _Toc244191795 \h </w:instrText>
+              <w:instrText xml:space="preserve"> PAGEREF _Toc244192503 \h </w:instrText>
             </w:r>
             <w:r>
               <w:rPr>
@@ -1487,7 +1486,7 @@
               <w:rPr>
                 <w:noProof/>
               </w:rPr>
-              <w:t>13</w:t>
+              <w:t>14</w:t>
             </w:r>
             <w:r>
               <w:rPr>
@@ -1515,7 +1514,7 @@
               <w14:ligatures w14:val="standardContextual"/>
             </w:rPr>
           </w:pPr>
-          <w:hyperlink w:anchor="_Toc244191796" w:history="1">
+          <w:hyperlink w:anchor="_Toc244192504" w:history="1">
             <w:r>
               <w:rPr>
                 <w:rStyle w:val="Hipervnculo"/>
@@ -1539,7 +1538,7 @@
               <w:rPr>
                 <w:noProof/>
               </w:rPr>
-              <w:instrText xml:space="preserve"> PAGEREF _Toc244191796 \h </w:instrText>
+              <w:instrText xml:space="preserve"> PAGEREF _Toc244192504 \h </w:instrText>
             </w:r>
             <w:r>
               <w:rPr>
@@ -1556,7 +1555,7 @@
               <w:rPr>
                 <w:noProof/>
               </w:rPr>
-              <w:t>14</w:t>
+              <w:t>15</w:t>
             </w:r>
             <w:r>
               <w:rPr>
@@ -1584,7 +1583,7 @@
               <w14:ligatures w14:val="standardContextual"/>
             </w:rPr>
           </w:pPr>
-          <w:hyperlink w:anchor="_Toc244191797" w:history="1">
+          <w:hyperlink w:anchor="_Toc244192505" w:history="1">
             <w:r>
               <w:rPr>
                 <w:rStyle w:val="Hipervnculo"/>
@@ -1608,7 +1607,7 @@
               <w:rPr>
                 <w:noProof/>
               </w:rPr>
-              <w:instrText xml:space="preserve"> PAGEREF _Toc244191797 \h </w:instrText>
+              <w:instrText xml:space="preserve"> PAGEREF _Toc244192505 \h </w:instrText>
             </w:r>
             <w:r>
               <w:rPr>
@@ -1625,7 +1624,7 @@
               <w:rPr>
                 <w:noProof/>
               </w:rPr>
-              <w:t>15</w:t>
+              <w:t>16</w:t>
             </w:r>
             <w:r>
               <w:rPr>
@@ -1653,7 +1652,7 @@
               <w14:ligatures w14:val="standardContextual"/>
             </w:rPr>
           </w:pPr>
-          <w:hyperlink w:anchor="_Toc244191798" w:history="1">
+          <w:hyperlink w:anchor="_Toc244192506" w:history="1">
             <w:r>
               <w:rPr>
                 <w:rStyle w:val="Hipervnculo"/>
@@ -1677,7 +1676,7 @@
               <w:rPr>
                 <w:noProof/>
               </w:rPr>
-              <w:instrText xml:space="preserve"> PAGEREF _Toc244191798 \h </w:instrText>
+              <w:instrText xml:space="preserve"> PAGEREF _Toc244192506 \h </w:instrText>
             </w:r>
             <w:r>
               <w:rPr>
@@ -1819,7 +1818,7 @@
         <w:pStyle w:val="Ttulo1"/>
         <w:pageBreakBefore/>
       </w:pPr>
-      <w:bookmarkStart w:id="1" w:name="_Toc244191782"/>
+      <w:bookmarkStart w:id="1" w:name="_Toc244192490"/>
       <w:r>
         <w:t>En una página</w:t>
       </w:r>
@@ -2228,7 +2227,7 @@
         <w:pStyle w:val="Ttulo1"/>
         <w:pageBreakBefore/>
       </w:pPr>
-      <w:bookmarkStart w:id="2" w:name="_Toc244191783"/>
+      <w:bookmarkStart w:id="2" w:name="_Toc244192491"/>
       <w:r>
         <w:t>1. Contexto</w:t>
       </w:r>
@@ -2238,7 +2237,7 @@
       <w:pPr>
         <w:pStyle w:val="Ttulo2"/>
       </w:pPr>
-      <w:bookmarkStart w:id="3" w:name="_Toc244191784"/>
+      <w:bookmarkStart w:id="3" w:name="_Toc244192492"/>
       <w:r>
         <w:t>1.1 El problema y la meta</w:t>
       </w:r>
@@ -2669,7 +2668,7 @@
       <w:pPr>
         <w:pStyle w:val="Ttulo2"/>
       </w:pPr>
-      <w:bookmarkStart w:id="4" w:name="_Toc244191785"/>
+      <w:bookmarkStart w:id="4" w:name="_Toc244192493"/>
       <w:r>
         <w:t>1.2 Base fisiológica y anatómica</w:t>
       </w:r>
@@ -2710,8 +2709,8 @@
           <w:noProof/>
         </w:rPr>
         <w:drawing>
-          <wp:inline distT="0" distB="0" distL="0" distR="0" wp14:anchorId="534936F0" wp14:editId="3ACD78C5">
-            <wp:extent cx="5905500" cy="2390775"/>
+          <wp:inline distT="0" distB="0" distL="0" distR="0" wp14:anchorId="5BB7E527" wp14:editId="38DEDD8A">
+            <wp:extent cx="6096000" cy="5029200"/>
             <wp:effectExtent l="0" t="0" r="0" b="0"/>
             <wp:docPr id="15" name="f09-bucle-glicemia.png" descr="Bucle de control de la glicemia según el Tema 2 del curso, y dónde entra el medidor propuesto." title="Figura 1"/>
             <wp:cNvGraphicFramePr>
@@ -2736,7 +2735,7 @@
                   <pic:spPr bwMode="auto">
                     <a:xfrm>
                       <a:off x="0" y="0"/>
-                      <a:ext cx="5905500" cy="2390775"/>
+                      <a:ext cx="6096000" cy="5029200"/>
                     </a:xfrm>
                     <a:prstGeom prst="rect">
                       <a:avLst/>
@@ -2929,7 +2928,7 @@
         <w:pStyle w:val="Ttulo1"/>
         <w:spacing w:before="240" w:after="160"/>
       </w:pPr>
-      <w:bookmarkStart w:id="5" w:name="_Toc244191786"/>
+      <w:bookmarkStart w:id="5" w:name="_Toc244192494"/>
       <w:r>
         <w:t>2. Las propuestas que estamos barajando</w:t>
       </w:r>
@@ -2939,7 +2938,7 @@
       <w:pPr>
         <w:pStyle w:val="Ttulo2"/>
       </w:pPr>
-      <w:bookmarkStart w:id="6" w:name="_Toc244191787"/>
+      <w:bookmarkStart w:id="6" w:name="_Toc244192495"/>
       <w:r>
         <w:t>2.1 Las ocho ideas</w:t>
       </w:r>
@@ -4854,7 +4853,7 @@
       <w:pPr>
         <w:pStyle w:val="Ttulo2"/>
       </w:pPr>
-      <w:bookmarkStart w:id="7" w:name="_Toc244191788"/>
+      <w:bookmarkStart w:id="7" w:name="_Toc244192496"/>
       <w:r>
         <w:t>2.2 Mapa de lo que sabemos y de lo que hemos desarrollado</w:t>
       </w:r>
@@ -4871,8 +4870,8 @@
           <w:noProof/>
         </w:rPr>
         <w:drawing>
-          <wp:inline distT="0" distB="0" distL="0" distR="0" wp14:anchorId="779EE066" wp14:editId="2513AA28">
-            <wp:extent cx="6096000" cy="3581400"/>
+          <wp:inline distT="0" distB="0" distL="0" distR="0" wp14:anchorId="58E5BED7" wp14:editId="00D7116E">
+            <wp:extent cx="6029325" cy="5276850"/>
             <wp:effectExtent l="0" t="0" r="0" b="0"/>
             <wp:docPr id="16" name="f14-mapa-propuestas.png" descr="Mapa de las ocho ideas. Más a la derecha hay más evidencia en personas. Más arriba hemos desarrollado más. Rojo: el dry lab las dejó no viables como están. Gris: no analizadas a fondo. Azul: herramienta útil. Azul con borde punteado: Propuesta. La ubicación es aproximada según el análisis dry lab." title="Figura 2"/>
             <wp:cNvGraphicFramePr>
@@ -4897,7 +4896,7 @@
                   <pic:spPr bwMode="auto">
                     <a:xfrm>
                       <a:off x="0" y="0"/>
-                      <a:ext cx="6096000" cy="3581400"/>
+                      <a:ext cx="6029325" cy="5276850"/>
                     </a:xfrm>
                     <a:prstGeom prst="rect">
                       <a:avLst/>
@@ -4937,7 +4936,7 @@
       <w:pPr>
         <w:pStyle w:val="Ttulo2"/>
       </w:pPr>
-      <w:bookmarkStart w:id="8" w:name="_Toc244191789"/>
+      <w:bookmarkStart w:id="8" w:name="_Toc244192497"/>
       <w:r>
         <w:t>2.3 Cinco de las ideas en palabras simples</w:t>
       </w:r>
@@ -5063,7 +5062,7 @@
         <w:pStyle w:val="Ttulo1"/>
         <w:spacing w:before="240" w:after="160"/>
       </w:pPr>
-      <w:bookmarkStart w:id="9" w:name="_Toc244191790"/>
+      <w:bookmarkStart w:id="9" w:name="_Toc244192498"/>
       <w:r>
         <w:t>3. Lo que hemos desarrollado</w:t>
       </w:r>
@@ -5073,7 +5072,7 @@
       <w:pPr>
         <w:pStyle w:val="Ttulo2"/>
       </w:pPr>
-      <w:bookmarkStart w:id="10" w:name="_Toc244191791"/>
+      <w:bookmarkStart w:id="10" w:name="_Toc244192499"/>
       <w:r>
         <w:t>3.1 Línea de tiempo</w:t>
       </w:r>
@@ -5701,7 +5700,7 @@
       <w:pPr>
         <w:pStyle w:val="Ttulo2"/>
       </w:pPr>
-      <w:bookmarkStart w:id="11" w:name="_Toc244191792"/>
+      <w:bookmarkStart w:id="11" w:name="_Toc244192500"/>
       <w:r>
         <w:t>3.2 La simulación de la tomografía del retraso</w:t>
       </w:r>
@@ -5726,8 +5725,8 @@
           <w:noProof/>
         </w:rPr>
         <w:drawing>
-          <wp:inline distT="0" distB="0" distL="0" distR="0" wp14:anchorId="7E73992B" wp14:editId="33C80241">
-            <wp:extent cx="5334000" cy="2705100"/>
+          <wp:inline distT="0" distB="0" distL="0" distR="0" wp14:anchorId="55C45BD6" wp14:editId="69040765">
+            <wp:extent cx="6086475" cy="3533775"/>
             <wp:effectExtent l="0" t="0" r="0" b="0"/>
             <wp:docPr id="17" name="f02-dos-profundidades.png" descr="Izquierda, el esquema. Derecha, la curva sintética que usa el repositorio: la sangre sube con una comida a los 90 minutos y baja a 50 mg/dL a los 300. Cada profundidad ve la misma curva, más tarde y más suavizada." title="Figura 3"/>
             <wp:cNvGraphicFramePr>
@@ -5752,7 +5751,7 @@
                   <pic:spPr bwMode="auto">
                     <a:xfrm>
                       <a:off x="0" y="0"/>
-                      <a:ext cx="5334000" cy="2705100"/>
+                      <a:ext cx="6086475" cy="3533775"/>
                     </a:xfrm>
                     <a:prstGeom prst="rect">
                       <a:avLst/>
@@ -5884,8 +5883,8 @@
           <w:noProof/>
         </w:rPr>
         <w:drawing>
-          <wp:inline distT="0" distB="0" distL="0" distR="0" wp14:anchorId="1B0B465E" wp14:editId="1A9733F5">
-            <wp:extent cx="5334000" cy="3181350"/>
+          <wp:inline distT="0" distB="0" distL="0" distR="0" wp14:anchorId="5A9C8D26" wp14:editId="42DFD461">
+            <wp:extent cx="5419725" cy="4343400"/>
             <wp:effectExtent l="0" t="0" r="0" b="0"/>
             <wp:docPr id="18" name="f07-requisito-ruido.png" descr="Error de la glucosa reconstruida en la persona típica. Con poco ruido, dos profundidades ganan. Sobre unos 5,9 mg/dL, corregir el retraso empeora el resultado. El cruce sale de solo tres niveles de ruido." title="Figura 4"/>
             <wp:cNvGraphicFramePr>
@@ -5910,7 +5909,7 @@
                   <pic:spPr bwMode="auto">
                     <a:xfrm>
                       <a:off x="0" y="0"/>
-                      <a:ext cx="5334000" cy="3181350"/>
+                      <a:ext cx="5419725" cy="4343400"/>
                     </a:xfrm>
                     <a:prstGeom prst="rect">
                       <a:avLst/>
@@ -6073,7 +6072,7 @@
       <w:pPr>
         <w:pStyle w:val="Ttulo2"/>
       </w:pPr>
-      <w:bookmarkStart w:id="12" w:name="_Toc244191793"/>
+      <w:bookmarkStart w:id="12" w:name="_Toc244192501"/>
       <w:r>
         <w:t>3.3 El análisis dry lab</w:t>
       </w:r>
@@ -6208,8 +6207,8 @@
           <w:noProof/>
         </w:rPr>
         <w:drawing>
-          <wp:inline distT="0" distB="0" distL="0" distR="0" wp14:anchorId="35B0ED22" wp14:editId="5F8614DB">
-            <wp:extent cx="6096000" cy="2886075"/>
+          <wp:inline distT="0" distB="0" distL="0" distR="0" wp14:anchorId="1FE36475" wp14:editId="7191A076">
+            <wp:extent cx="5800725" cy="4924425"/>
             <wp:effectExtent l="0" t="0" r="0" b="0"/>
             <wp:docPr id="19" name="f10-profundidades.png" descr="Capas de la piel de antebrazo y profundidad que muestrea cada tecnología, con eje logarítmico. Fuentes: Sandby-Møller et al. (2003), Kottmann et al. (2016), Uluç et al. (2024), Zhang et al. (2025), Lundsgaard-Nielsen et al. (2018), Prlić et al. (2022) y Ahmad et al. (2025). El espesor de la dermis y la profundidad del CGM subcutáneo no se extrajeron de las fuentes." title="Figura 5"/>
             <wp:cNvGraphicFramePr>
@@ -6234,7 +6233,7 @@
                   <pic:spPr bwMode="auto">
                     <a:xfrm>
                       <a:off x="0" y="0"/>
-                      <a:ext cx="6096000" cy="2886075"/>
+                      <a:ext cx="5800725" cy="4924425"/>
                     </a:xfrm>
                     <a:prstGeom prst="rect">
                       <a:avLst/>
@@ -6312,8 +6311,8 @@
           <w:noProof/>
         </w:rPr>
         <w:drawing>
-          <wp:inline distT="0" distB="0" distL="0" distR="0" wp14:anchorId="35DAF7CA" wp14:editId="2C60DF3E">
-            <wp:extent cx="5715000" cy="3238500"/>
+          <wp:inline distT="0" distB="0" distL="0" distR="0" wp14:anchorId="7AC5C567" wp14:editId="1032E80C">
+            <wp:extent cx="5305425" cy="3638550"/>
             <wp:effectExtent l="0" t="0" r="0" b="0"/>
             <wp:docPr id="20" name="f12-fusion.png" descr="Ruido fusionado sobre ruido de un solo sensor, según el número de sensores iguales y la correlación entre sus errores. Las líneas punteadas son los límites √ρ. Los puntos son los dos valores de ρ estimados con la redundancia de dos electrodos de un CGM (Sharifi et al., 2016)." title="Figura 6"/>
             <wp:cNvGraphicFramePr>
@@ -6338,7 +6337,7 @@
                   <pic:spPr bwMode="auto">
                     <a:xfrm>
                       <a:off x="0" y="0"/>
-                      <a:ext cx="5715000" cy="3238500"/>
+                      <a:ext cx="5305425" cy="3638550"/>
                     </a:xfrm>
                     <a:prstGeom prst="rect">
                       <a:avLst/>
@@ -7416,7 +7415,7 @@
         <w:pStyle w:val="Ttulo1"/>
         <w:spacing w:before="240" w:after="160"/>
       </w:pPr>
-      <w:bookmarkStart w:id="13" w:name="_Toc244191794"/>
+      <w:bookmarkStart w:id="13" w:name="_Toc244192502"/>
       <w:r>
         <w:t>4. Qué podría cambiar</w:t>
       </w:r>
@@ -7426,7 +7425,7 @@
       <w:pPr>
         <w:pStyle w:val="Ttulo2"/>
       </w:pPr>
-      <w:bookmarkStart w:id="14" w:name="_Toc244191795"/>
+      <w:bookmarkStart w:id="14" w:name="_Toc244192503"/>
       <w:r>
         <w:t>4.1 Cuatro opciones</w:t>
       </w:r>
@@ -8631,9 +8630,9 @@
     <w:p>
       <w:pPr>
         <w:pStyle w:val="Ttulo1"/>
-        <w:spacing w:before="240" w:after="160"/>
-      </w:pPr>
-      <w:bookmarkStart w:id="15" w:name="_Toc244191796"/>
+        <w:pageBreakBefore/>
+      </w:pPr>
+      <w:bookmarkStart w:id="15" w:name="_Toc244192504"/>
       <w:r>
         <w:t>5. Preguntas para su retroalimentación</w:t>
       </w:r>
@@ -8688,6 +8687,9 @@
             </w:tcMar>
           </w:tcPr>
           <w:p>
+            <w:pPr>
+              <w:keepNext/>
+            </w:pPr>
             <w:r>
               <w:rPr>
                 <w:b/>
@@ -8718,6 +8720,9 @@
             </w:tcMar>
           </w:tcPr>
           <w:p>
+            <w:pPr>
+              <w:keepNext/>
+            </w:pPr>
             <w:r>
               <w:rPr>
                 <w:b/>
@@ -8791,6 +8796,9 @@
             </w:tcMar>
           </w:tcPr>
           <w:p>
+            <w:pPr>
+              <w:keepNext/>
+            </w:pPr>
             <w:r>
               <w:rPr>
                 <w:b/>
@@ -8827,16 +8835,13 @@
           </w:tcPr>
           <w:p>
             <w:pPr>
+              <w:keepNext/>
               <w:spacing w:after="240"/>
             </w:pPr>
           </w:p>
           <w:p>
             <w:pPr>
-              <w:spacing w:after="240"/>
-            </w:pPr>
-          </w:p>
-          <w:p>
-            <w:pPr>
+              <w:keepNext/>
               <w:spacing w:after="240"/>
             </w:pPr>
           </w:p>
@@ -8863,6 +8868,9 @@
             </w:tcMar>
           </w:tcPr>
           <w:p>
+            <w:pPr>
+              <w:keepNext/>
+            </w:pPr>
             <w:r>
               <w:rPr>
                 <w:b/>
@@ -8899,16 +8907,13 @@
           </w:tcPr>
           <w:p>
             <w:pPr>
+              <w:keepNext/>
               <w:spacing w:after="240"/>
             </w:pPr>
           </w:p>
           <w:p>
             <w:pPr>
-              <w:spacing w:after="240"/>
-            </w:pPr>
-          </w:p>
-          <w:p>
-            <w:pPr>
+              <w:keepNext/>
               <w:spacing w:after="240"/>
             </w:pPr>
           </w:p>
@@ -8974,6 +8979,9 @@
             </w:tcMar>
           </w:tcPr>
           <w:p>
+            <w:pPr>
+              <w:keepNext/>
+            </w:pPr>
             <w:r>
               <w:rPr>
                 <w:b/>
@@ -9010,16 +9018,13 @@
           </w:tcPr>
           <w:p>
             <w:pPr>
+              <w:keepNext/>
               <w:spacing w:after="240"/>
             </w:pPr>
           </w:p>
           <w:p>
             <w:pPr>
-              <w:spacing w:after="240"/>
-            </w:pPr>
-          </w:p>
-          <w:p>
-            <w:pPr>
+              <w:keepNext/>
               <w:spacing w:after="240"/>
             </w:pPr>
           </w:p>
@@ -9046,6 +9051,9 @@
             </w:tcMar>
           </w:tcPr>
           <w:p>
+            <w:pPr>
+              <w:keepNext/>
+            </w:pPr>
             <w:r>
               <w:rPr>
                 <w:b/>
@@ -9082,16 +9090,13 @@
           </w:tcPr>
           <w:p>
             <w:pPr>
+              <w:keepNext/>
               <w:spacing w:after="240"/>
             </w:pPr>
           </w:p>
           <w:p>
             <w:pPr>
-              <w:spacing w:after="240"/>
-            </w:pPr>
-          </w:p>
-          <w:p>
-            <w:pPr>
+              <w:keepNext/>
               <w:spacing w:after="240"/>
             </w:pPr>
           </w:p>
@@ -9157,6 +9162,9 @@
             </w:tcMar>
           </w:tcPr>
           <w:p>
+            <w:pPr>
+              <w:keepNext/>
+            </w:pPr>
             <w:r>
               <w:rPr>
                 <w:b/>
@@ -9193,16 +9201,13 @@
           </w:tcPr>
           <w:p>
             <w:pPr>
+              <w:keepNext/>
               <w:spacing w:after="240"/>
             </w:pPr>
           </w:p>
           <w:p>
             <w:pPr>
-              <w:spacing w:after="240"/>
-            </w:pPr>
-          </w:p>
-          <w:p>
-            <w:pPr>
+              <w:keepNext/>
               <w:spacing w:after="240"/>
             </w:pPr>
           </w:p>
@@ -9229,6 +9234,9 @@
             </w:tcMar>
           </w:tcPr>
           <w:p>
+            <w:pPr>
+              <w:keepNext/>
+            </w:pPr>
             <w:r>
               <w:rPr>
                 <w:b/>
@@ -9265,16 +9273,13 @@
           </w:tcPr>
           <w:p>
             <w:pPr>
+              <w:keepNext/>
               <w:spacing w:after="240"/>
             </w:pPr>
           </w:p>
           <w:p>
             <w:pPr>
-              <w:spacing w:after="240"/>
-            </w:pPr>
-          </w:p>
-          <w:p>
-            <w:pPr>
+              <w:keepNext/>
               <w:spacing w:after="240"/>
             </w:pPr>
           </w:p>
@@ -9340,6 +9345,9 @@
             </w:tcMar>
           </w:tcPr>
           <w:p>
+            <w:pPr>
+              <w:keepNext/>
+            </w:pPr>
             <w:r>
               <w:rPr>
                 <w:b/>
@@ -9376,25 +9384,23 @@
           </w:tcPr>
           <w:p>
             <w:pPr>
+              <w:keepNext/>
               <w:spacing w:after="240"/>
             </w:pPr>
           </w:p>
           <w:p>
             <w:pPr>
+              <w:keepNext/>
               <w:spacing w:after="240"/>
             </w:pPr>
           </w:p>
-          <w:p>
-            <w:pPr>
-              <w:spacing w:after="240"/>
-            </w:pPr>
-          </w:p>
         </w:tc>
       </w:tr>
     </w:tbl>
     <w:p>
       <w:pPr>
-        <w:spacing w:after="200"/>
+        <w:keepNext/>
+        <w:spacing w:line="120" w:lineRule="exact"/>
       </w:pPr>
     </w:p>
     <w:tbl>
@@ -9465,16 +9471,6 @@
               <w:spacing w:after="240"/>
             </w:pPr>
           </w:p>
-          <w:p>
-            <w:pPr>
-              <w:spacing w:after="240"/>
-            </w:pPr>
-          </w:p>
-          <w:p>
-            <w:pPr>
-              <w:spacing w:after="240"/>
-            </w:pPr>
-          </w:p>
         </w:tc>
       </w:tr>
     </w:tbl>
@@ -9488,7 +9484,7 @@
         <w:pStyle w:val="Ttulo1"/>
         <w:spacing w:before="240" w:after="160"/>
       </w:pPr>
-      <w:bookmarkStart w:id="16" w:name="_Toc244191797"/>
+      <w:bookmarkStart w:id="16" w:name="_Toc244192505"/>
       <w:r>
         <w:t>Referencias principales</w:t>
       </w:r>
@@ -10976,7 +10972,7 @@
         <w:pStyle w:val="Ttulo1"/>
         <w:spacing w:before="240" w:after="160"/>
       </w:pPr>
-      <w:bookmarkStart w:id="17" w:name="_Toc244191798"/>
+      <w:bookmarkStart w:id="17" w:name="_Toc244192506"/>
       <w:r>
         <w:t>Uso de inteligencia artificial</w:t>
       </w:r>
@@ -11129,118 +11125,118 @@
 <file path=word/numbering.xml><?xml version="1.0" encoding="utf-8"?>
 <w:numbering xmlns:wpc="http://schemas.microsoft.com/office/word/2010/wordprocessingCanvas" xmlns:cx="http://schemas.microsoft.com/office/drawing/2014/chartex" xmlns:cx1="http://schemas.microsoft.com/office/drawing/2015/9/8/chartex" xmlns:cx2="http://schemas.microsoft.com/office/drawing/2015/10/21/chartex" xmlns:cx3="http://schemas.microsoft.com/office/drawing/2016/5/9/chartex" xmlns:cx4="http://schemas.microsoft.com/office/drawing/2016/5/10/chartex" xmlns:cx5="http://schemas.microsoft.com/office/drawing/2016/5/11/chartex" xmlns:cx6="http://schemas.microsoft.com/office/drawing/2016/5/12/chartex" xmlns:cx7="http://schemas.microsoft.com/office/drawing/2016/5/13/chartex" xmlns:cx8="http://schemas.microsoft.com/office/drawing/2016/5/14/chartex" xmlns:mc="http://schemas.openxmlformats.org/markup-compatibility/2006" xmlns:aink="http://schemas.microsoft.com/office/drawing/2016/ink" xmlns:am3d="http://schemas.microsoft.com/office/drawing/2017/model3d" xmlns:o="urn:schemas-microsoft-com:office:office" xmlns:oel="http://schemas.microsoft.com/office/2019/extlst" xmlns:r="http://schemas.openxmlformats.org/officeDocument/2006/relationships" xmlns:m="http://schemas.openxmlformats.org/officeDocument/2006/math" xmlns:v="urn:schemas-microsoft-com:vml" xmlns:wp14="http://schemas.microsoft.com/office/word/2010/wordprocessingDrawing" xmlns:wp="http://schemas.openxmlformats.org/drawingml/2006/wordprocessingDrawing" xmlns:w10="urn:schemas-microsoft-com:office:word" xmlns:w="http://schemas.openxmlformats.org/wordprocessingml/2006/main" xmlns:w14="http://schemas.microsoft.com/office/word/2010/wordml" xmlns:w15="http://schemas.microsoft.com/office/word/2012/wordml" xmlns:w16cex="http://schemas.microsoft.com/office/word/2018/wordml/cex" xmlns:w16cid="http://schemas.microsoft.com/office/word/2016/wordml/cid" xmlns:w16="http://schemas.microsoft.com/office/word/2018/wordml" xmlns:w16du="http://schemas.microsoft.com/office/word/2023/wordml/word16du" xmlns:w16sdtdh="http://schemas.microsoft.com/office/word/2020/wordml/sdtdatahash" xmlns:w16sdtfl="http://schemas.microsoft.com/office/word/2024/wordml/sdtformatlock" xmlns:w16se="http://schemas.microsoft.com/office/word/2015/wordml/symex" xmlns:wpg="http://schemas.microsoft.com/office/word/2010/wordprocessingGroup" xmlns:wpi="http://schemas.microsoft.com/office/word/2010/wordprocessingInk" xmlns:wne="http://schemas.microsoft.com/office/word/2006/wordml" xmlns:wps="http://schemas.microsoft.com/office/word/2010/wordprocessingShape" mc:Ignorable="w14 w15 w16se w16cid w16 w16cex w16sdtdh w16sdtfl w16du wp14">
   <w:abstractNum w:abstractNumId="0" w15:restartNumberingAfterBreak="0">
-    <w:nsid w:val="1B7A5892"/>
+    <w:nsid w:val="00CA6919"/>
     <w:multiLevelType w:val="hybridMultilevel"/>
-    <w:tmpl w:val="23AE4E44"/>
-    <w:lvl w:ilvl="0" w:tplc="E74AB88A" w:tentative="1">
+    <w:tmpl w:val="3FB4397A"/>
+    <w:lvl w:ilvl="0" w:tplc="60FAE2F2">
       <w:start w:val="1"/>
-      <w:numFmt w:val="decimal"/>
-      <w:lvlText w:val="%1."/>
+      <w:numFmt w:val="bullet"/>
+      <w:lvlText w:val="•"/>
       <w:lvlJc w:val="left"/>
       <w:pPr>
-        <w:ind w:left="600" w:hanging="360"/>
+        <w:ind w:left="600" w:hanging="300"/>
       </w:pPr>
     </w:lvl>
-    <w:lvl w:ilvl="1" w:tplc="265C04FA">
+    <w:lvl w:ilvl="1" w:tplc="F5BE21AA">
       <w:numFmt w:val="decimal"/>
       <w:lvlText w:val=""/>
       <w:lvlJc w:val="left"/>
     </w:lvl>
-    <w:lvl w:ilvl="2" w:tplc="563CCBF0">
+    <w:lvl w:ilvl="2" w:tplc="BCE2A262">
       <w:numFmt w:val="decimal"/>
       <w:lvlText w:val=""/>
       <w:lvlJc w:val="left"/>
     </w:lvl>
-    <w:lvl w:ilvl="3" w:tplc="5754A6D0">
+    <w:lvl w:ilvl="3" w:tplc="14AEAD86">
       <w:numFmt w:val="decimal"/>
       <w:lvlText w:val=""/>
       <w:lvlJc w:val="left"/>
     </w:lvl>
-    <w:lvl w:ilvl="4" w:tplc="E5B27920">
+    <w:lvl w:ilvl="4" w:tplc="6F825178">
       <w:numFmt w:val="decimal"/>
       <w:lvlText w:val=""/>
       <w:lvlJc w:val="left"/>
     </w:lvl>
-    <w:lvl w:ilvl="5" w:tplc="1B18E922">
+    <w:lvl w:ilvl="5" w:tplc="02CCCF8E">
       <w:numFmt w:val="decimal"/>
       <w:lvlText w:val=""/>
       <w:lvlJc w:val="left"/>
     </w:lvl>
-    <w:lvl w:ilvl="6" w:tplc="4C7A385E">
+    <w:lvl w:ilvl="6" w:tplc="F92CB66E">
       <w:numFmt w:val="decimal"/>
       <w:lvlText w:val=""/>
       <w:lvlJc w:val="left"/>
     </w:lvl>
-    <w:lvl w:ilvl="7" w:tplc="DBB2EE76">
+    <w:lvl w:ilvl="7" w:tplc="32229066">
       <w:numFmt w:val="decimal"/>
       <w:lvlText w:val=""/>
       <w:lvlJc w:val="left"/>
     </w:lvl>
-    <w:lvl w:ilvl="8" w:tplc="AB0EB716">
+    <w:lvl w:ilvl="8" w:tplc="016623A6">
       <w:numFmt w:val="decimal"/>
       <w:lvlText w:val=""/>
       <w:lvlJc w:val="left"/>
     </w:lvl>
   </w:abstractNum>
   <w:abstractNum w:abstractNumId="1" w15:restartNumberingAfterBreak="0">
-    <w:nsid w:val="234B203E"/>
+    <w:nsid w:val="0D9B31B1"/>
     <w:multiLevelType w:val="hybridMultilevel"/>
-    <w:tmpl w:val="2FDECAAA"/>
-    <w:lvl w:ilvl="0" w:tplc="89E0FBE6">
+    <w:tmpl w:val="0956667C"/>
+    <w:lvl w:ilvl="0" w:tplc="2B1C6006" w:tentative="1">
       <w:start w:val="1"/>
-      <w:numFmt w:val="bullet"/>
-      <w:lvlText w:val="•"/>
+      <w:numFmt w:val="decimal"/>
+      <w:lvlText w:val="%1."/>
       <w:lvlJc w:val="left"/>
       <w:pPr>
-        <w:ind w:left="600" w:hanging="300"/>
+        <w:ind w:left="600" w:hanging="360"/>
       </w:pPr>
     </w:lvl>
-    <w:lvl w:ilvl="1" w:tplc="58A638DC">
+    <w:lvl w:ilvl="1" w:tplc="584CD3C4">
       <w:numFmt w:val="decimal"/>
       <w:lvlText w:val=""/>
       <w:lvlJc w:val="left"/>
     </w:lvl>
-    <w:lvl w:ilvl="2" w:tplc="A3AA514C">
+    <w:lvl w:ilvl="2" w:tplc="91001FE0">
       <w:numFmt w:val="decimal"/>
       <w:lvlText w:val=""/>
       <w:lvlJc w:val="left"/>
     </w:lvl>
-    <w:lvl w:ilvl="3" w:tplc="4D1446E4">
+    <w:lvl w:ilvl="3" w:tplc="1C289FBA">
       <w:numFmt w:val="decimal"/>
       <w:lvlText w:val=""/>
       <w:lvlJc w:val="left"/>
     </w:lvl>
-    <w:lvl w:ilvl="4" w:tplc="13B2D68A">
+    <w:lvl w:ilvl="4" w:tplc="4CFA812C">
       <w:numFmt w:val="decimal"/>
       <w:lvlText w:val=""/>
       <w:lvlJc w:val="left"/>
     </w:lvl>
-    <w:lvl w:ilvl="5" w:tplc="27B22940">
+    <w:lvl w:ilvl="5" w:tplc="1AB865EE">
       <w:numFmt w:val="decimal"/>
       <w:lvlText w:val=""/>
       <w:lvlJc w:val="left"/>
     </w:lvl>
-    <w:lvl w:ilvl="6" w:tplc="C10A5784">
+    <w:lvl w:ilvl="6" w:tplc="C354123E">
       <w:numFmt w:val="decimal"/>
       <w:lvlText w:val=""/>
       <w:lvlJc w:val="left"/>
     </w:lvl>
-    <w:lvl w:ilvl="7" w:tplc="DC88E96A">
+    <w:lvl w:ilvl="7" w:tplc="59F45DB0">
       <w:numFmt w:val="decimal"/>
       <w:lvlText w:val=""/>
       <w:lvlJc w:val="left"/>
     </w:lvl>
-    <w:lvl w:ilvl="8" w:tplc="45B0DA5C">
+    <w:lvl w:ilvl="8" w:tplc="8ED2A714">
       <w:numFmt w:val="decimal"/>
       <w:lvlText w:val=""/>
       <w:lvlJc w:val="left"/>
     </w:lvl>
   </w:abstractNum>
   <w:abstractNum w:abstractNumId="2" w15:restartNumberingAfterBreak="0">
-    <w:nsid w:val="3D187F72"/>
+    <w:nsid w:val="27966799"/>
     <w:multiLevelType w:val="hybridMultilevel"/>
-    <w:tmpl w:val="2130A3FE"/>
-    <w:lvl w:ilvl="0" w:tplc="BD6E9F2C" w:tentative="1">
+    <w:tmpl w:val="6250F11C"/>
+    <w:lvl w:ilvl="0" w:tplc="7228080C" w:tentative="1">
       <w:start w:val="1"/>
       <w:numFmt w:val="decimal"/>
       <w:lvlText w:val="%1."/>
@@ -11249,138 +11245,52 @@
         <w:ind w:left="600" w:hanging="360"/>
       </w:pPr>
     </w:lvl>
-    <w:lvl w:ilvl="1" w:tplc="05B2EE40">
+    <w:lvl w:ilvl="1" w:tplc="FA4E4A50">
       <w:numFmt w:val="decimal"/>
       <w:lvlText w:val=""/>
       <w:lvlJc w:val="left"/>
     </w:lvl>
-    <w:lvl w:ilvl="2" w:tplc="C6FEAF28">
+    <w:lvl w:ilvl="2" w:tplc="6C72DD0E">
       <w:numFmt w:val="decimal"/>
       <w:lvlText w:val=""/>
       <w:lvlJc w:val="left"/>
     </w:lvl>
-    <w:lvl w:ilvl="3" w:tplc="2AF8D2F8">
+    <w:lvl w:ilvl="3" w:tplc="14623E84">
       <w:numFmt w:val="decimal"/>
       <w:lvlText w:val=""/>
       <w:lvlJc w:val="left"/>
     </w:lvl>
-    <w:lvl w:ilvl="4" w:tplc="FF5CF3B4">
+    <w:lvl w:ilvl="4" w:tplc="AA3645A4">
       <w:numFmt w:val="decimal"/>
       <w:lvlText w:val=""/>
       <w:lvlJc w:val="left"/>
     </w:lvl>
-    <w:lvl w:ilvl="5" w:tplc="C9DA5346">
+    <w:lvl w:ilvl="5" w:tplc="3BA0BB04">
       <w:numFmt w:val="decimal"/>
       <w:lvlText w:val=""/>
       <w:lvlJc w:val="left"/>
     </w:lvl>
-    <w:lvl w:ilvl="6" w:tplc="1742B55E">
+    <w:lvl w:ilvl="6" w:tplc="309C616E">
       <w:numFmt w:val="decimal"/>
       <w:lvlText w:val=""/>
       <w:lvlJc w:val="left"/>
     </w:lvl>
-    <w:lvl w:ilvl="7" w:tplc="63F059C8">
+    <w:lvl w:ilvl="7" w:tplc="338E479C">
       <w:numFmt w:val="decimal"/>
       <w:lvlText w:val=""/>
       <w:lvlJc w:val="left"/>
     </w:lvl>
-    <w:lvl w:ilvl="8" w:tplc="B4E2F44E">
+    <w:lvl w:ilvl="8" w:tplc="BC664D70">
       <w:numFmt w:val="decimal"/>
       <w:lvlText w:val=""/>
       <w:lvlJc w:val="left"/>
     </w:lvl>
   </w:abstractNum>
   <w:abstractNum w:abstractNumId="3" w15:restartNumberingAfterBreak="0">
-    <w:nsid w:val="40774FDF"/>
+    <w:nsid w:val="30795882"/>
     <w:multiLevelType w:val="hybridMultilevel"/>
-    <w:tmpl w:val="3604848E"/>
-    <w:lvl w:ilvl="0" w:tplc="A36E1BFA" w:tentative="1">
-      <w:start w:val="1"/>
-      <w:numFmt w:val="bullet"/>
-      <w:lvlText w:val="●"/>
-      <w:lvlJc w:val="left"/>
-      <w:pPr>
-        <w:ind w:left="720" w:hanging="360"/>
-      </w:pPr>
-    </w:lvl>
-    <w:lvl w:ilvl="1" w:tplc="89C02000" w:tentative="1">
-      <w:start w:val="1"/>
-      <w:numFmt w:val="bullet"/>
-      <w:lvlText w:val="○"/>
-      <w:lvlJc w:val="left"/>
-      <w:pPr>
-        <w:ind w:left="1440" w:hanging="360"/>
-      </w:pPr>
-    </w:lvl>
-    <w:lvl w:ilvl="2" w:tplc="EFDA0B7E" w:tentative="1">
-      <w:start w:val="1"/>
-      <w:numFmt w:val="bullet"/>
-      <w:lvlText w:val="■"/>
-      <w:lvlJc w:val="left"/>
-      <w:pPr>
-        <w:ind w:left="2160" w:hanging="360"/>
-      </w:pPr>
-    </w:lvl>
-    <w:lvl w:ilvl="3" w:tplc="353CB5D4" w:tentative="1">
-      <w:start w:val="1"/>
-      <w:numFmt w:val="bullet"/>
-      <w:lvlText w:val="●"/>
-      <w:lvlJc w:val="left"/>
-      <w:pPr>
-        <w:ind w:left="2880" w:hanging="360"/>
-      </w:pPr>
-    </w:lvl>
-    <w:lvl w:ilvl="4" w:tplc="16FAE060" w:tentative="1">
-      <w:start w:val="1"/>
-      <w:numFmt w:val="bullet"/>
-      <w:lvlText w:val="○"/>
-      <w:lvlJc w:val="left"/>
-      <w:pPr>
-        <w:ind w:left="3600" w:hanging="360"/>
-      </w:pPr>
-    </w:lvl>
-    <w:lvl w:ilvl="5" w:tplc="4C32A518" w:tentative="1">
-      <w:start w:val="1"/>
-      <w:numFmt w:val="bullet"/>
-      <w:lvlText w:val="■"/>
-      <w:lvlJc w:val="left"/>
-      <w:pPr>
-        <w:ind w:left="4320" w:hanging="360"/>
-      </w:pPr>
-    </w:lvl>
-    <w:lvl w:ilvl="6" w:tplc="1840D352" w:tentative="1">
-      <w:start w:val="1"/>
-      <w:numFmt w:val="bullet"/>
-      <w:lvlText w:val="●"/>
-      <w:lvlJc w:val="left"/>
-      <w:pPr>
-        <w:ind w:left="5040" w:hanging="360"/>
-      </w:pPr>
-    </w:lvl>
-    <w:lvl w:ilvl="7" w:tplc="82660F28" w:tentative="1">
-      <w:start w:val="1"/>
-      <w:numFmt w:val="bullet"/>
-      <w:lvlText w:val="●"/>
-      <w:lvlJc w:val="left"/>
-      <w:pPr>
-        <w:ind w:left="5760" w:hanging="360"/>
-      </w:pPr>
-    </w:lvl>
-    <w:lvl w:ilvl="8" w:tplc="DEDE8960" w:tentative="1">
-      <w:start w:val="1"/>
-      <w:numFmt w:val="bullet"/>
-      <w:lvlText w:val="●"/>
-      <w:lvlJc w:val="left"/>
-      <w:pPr>
-        <w:ind w:left="6480" w:hanging="360"/>
-      </w:pPr>
-    </w:lvl>
-  </w:abstractNum>
-  <w:abstractNum w:abstractNumId="4" w15:restartNumberingAfterBreak="0">
-    <w:nsid w:val="45DD6A3D"/>
-    <w:multiLevelType w:val="hybridMultilevel"/>
-    <w:tmpl w:val="D7A6A3DA"/>
-    <w:lvl w:ilvl="0" w:tplc="542A4B3E" w:tentative="1">
+    <w:tmpl w:val="9D6E1D40"/>
+    <w:lvl w:ilvl="0" w:tplc="6A524370" w:tentative="1">
       <w:start w:val="1"/>
       <w:numFmt w:val="decimal"/>
       <w:lvlText w:val="%1."/>
@@ -11389,52 +11299,138 @@
         <w:ind w:left="600" w:hanging="360"/>
       </w:pPr>
     </w:lvl>
-    <w:lvl w:ilvl="1" w:tplc="0B786A80">
+    <w:lvl w:ilvl="1" w:tplc="ABA69B7C">
       <w:numFmt w:val="decimal"/>
       <w:lvlText w:val=""/>
       <w:lvlJc w:val="left"/>
     </w:lvl>
-    <w:lvl w:ilvl="2" w:tplc="4E28EBFA">
+    <w:lvl w:ilvl="2" w:tplc="67186242">
       <w:numFmt w:val="decimal"/>
       <w:lvlText w:val=""/>
       <w:lvlJc w:val="left"/>
     </w:lvl>
-    <w:lvl w:ilvl="3" w:tplc="60B21D3A">
+    <w:lvl w:ilvl="3" w:tplc="DA7429F8">
       <w:numFmt w:val="decimal"/>
       <w:lvlText w:val=""/>
       <w:lvlJc w:val="left"/>
     </w:lvl>
-    <w:lvl w:ilvl="4" w:tplc="876A603A">
+    <w:lvl w:ilvl="4" w:tplc="58063FEE">
       <w:numFmt w:val="decimal"/>
       <w:lvlText w:val=""/>
       <w:lvlJc w:val="left"/>
     </w:lvl>
-    <w:lvl w:ilvl="5" w:tplc="16D08BAA">
+    <w:lvl w:ilvl="5" w:tplc="E88C00BE">
       <w:numFmt w:val="decimal"/>
       <w:lvlText w:val=""/>
       <w:lvlJc w:val="left"/>
     </w:lvl>
-    <w:lvl w:ilvl="6" w:tplc="8B0CE012">
+    <w:lvl w:ilvl="6" w:tplc="F7BC6E64">
       <w:numFmt w:val="decimal"/>
       <w:lvlText w:val=""/>
       <w:lvlJc w:val="left"/>
     </w:lvl>
-    <w:lvl w:ilvl="7" w:tplc="D7B03E52">
+    <w:lvl w:ilvl="7" w:tplc="93165C44">
       <w:numFmt w:val="decimal"/>
       <w:lvlText w:val=""/>
       <w:lvlJc w:val="left"/>
     </w:lvl>
-    <w:lvl w:ilvl="8" w:tplc="1FA07D92">
+    <w:lvl w:ilvl="8" w:tplc="F7ECC432">
       <w:numFmt w:val="decimal"/>
       <w:lvlText w:val=""/>
       <w:lvlJc w:val="left"/>
     </w:lvl>
   </w:abstractNum>
+  <w:abstractNum w:abstractNumId="4" w15:restartNumberingAfterBreak="0">
+    <w:nsid w:val="67C4145E"/>
+    <w:multiLevelType w:val="hybridMultilevel"/>
+    <w:tmpl w:val="5CA0C6F0"/>
+    <w:lvl w:ilvl="0" w:tplc="5A444CF4" w:tentative="1">
+      <w:start w:val="1"/>
+      <w:numFmt w:val="bullet"/>
+      <w:lvlText w:val="●"/>
+      <w:lvlJc w:val="left"/>
+      <w:pPr>
+        <w:ind w:left="720" w:hanging="360"/>
+      </w:pPr>
+    </w:lvl>
+    <w:lvl w:ilvl="1" w:tplc="7B04E220" w:tentative="1">
+      <w:start w:val="1"/>
+      <w:numFmt w:val="bullet"/>
+      <w:lvlText w:val="○"/>
+      <w:lvlJc w:val="left"/>
+      <w:pPr>
+        <w:ind w:left="1440" w:hanging="360"/>
+      </w:pPr>
+    </w:lvl>
+    <w:lvl w:ilvl="2" w:tplc="94F876AC" w:tentative="1">
+      <w:start w:val="1"/>
+      <w:numFmt w:val="bullet"/>
+      <w:lvlText w:val="■"/>
+      <w:lvlJc w:val="left"/>
+      <w:pPr>
+        <w:ind w:left="2160" w:hanging="360"/>
+      </w:pPr>
+    </w:lvl>
+    <w:lvl w:ilvl="3" w:tplc="0D5A9CC2" w:tentative="1">
+      <w:start w:val="1"/>
+      <w:numFmt w:val="bullet"/>
+      <w:lvlText w:val="●"/>
+      <w:lvlJc w:val="left"/>
+      <w:pPr>
+        <w:ind w:left="2880" w:hanging="360"/>
+      </w:pPr>
+    </w:lvl>
+    <w:lvl w:ilvl="4" w:tplc="4A6803C2" w:tentative="1">
+      <w:start w:val="1"/>
+      <w:numFmt w:val="bullet"/>
+      <w:lvlText w:val="○"/>
+      <w:lvlJc w:val="left"/>
+      <w:pPr>
+        <w:ind w:left="3600" w:hanging="360"/>
+      </w:pPr>
+    </w:lvl>
+    <w:lvl w:ilvl="5" w:tplc="9AC2921C" w:tentative="1">
+      <w:start w:val="1"/>
+      <w:numFmt w:val="bullet"/>
+      <w:lvlText w:val="■"/>
+      <w:lvlJc w:val="left"/>
+      <w:pPr>
+        <w:ind w:left="4320" w:hanging="360"/>
+      </w:pPr>
+    </w:lvl>
+    <w:lvl w:ilvl="6" w:tplc="B3CE630C" w:tentative="1">
+      <w:start w:val="1"/>
+      <w:numFmt w:val="bullet"/>
+      <w:lvlText w:val="●"/>
+      <w:lvlJc w:val="left"/>
+      <w:pPr>
+        <w:ind w:left="5040" w:hanging="360"/>
+      </w:pPr>
+    </w:lvl>
+    <w:lvl w:ilvl="7" w:tplc="62222B7C" w:tentative="1">
+      <w:start w:val="1"/>
+      <w:numFmt w:val="bullet"/>
+      <w:lvlText w:val="●"/>
+      <w:lvlJc w:val="left"/>
+      <w:pPr>
+        <w:ind w:left="5760" w:hanging="360"/>
+      </w:pPr>
+    </w:lvl>
+    <w:lvl w:ilvl="8" w:tplc="B4885D4C" w:tentative="1">
+      <w:start w:val="1"/>
+      <w:numFmt w:val="bullet"/>
+      <w:lvlText w:val="●"/>
+      <w:lvlJc w:val="left"/>
+      <w:pPr>
+        <w:ind w:left="6480" w:hanging="360"/>
+      </w:pPr>
+    </w:lvl>
+  </w:abstractNum>
   <w:abstractNum w:abstractNumId="5" w15:restartNumberingAfterBreak="0">
-    <w:nsid w:val="70C222BF"/>
+    <w:nsid w:val="74D54E8F"/>
     <w:multiLevelType w:val="hybridMultilevel"/>
-    <w:tmpl w:val="790C6498"/>
-    <w:lvl w:ilvl="0" w:tplc="8A62698E" w:tentative="1">
+    <w:tmpl w:val="FCD8ADFC"/>
+    <w:lvl w:ilvl="0" w:tplc="214E1B44" w:tentative="1">
       <w:start w:val="1"/>
       <w:numFmt w:val="decimal"/>
       <w:lvlText w:val="%1."/>
@@ -11443,55 +11439,55 @@
         <w:ind w:left="600" w:hanging="360"/>
       </w:pPr>
     </w:lvl>
-    <w:lvl w:ilvl="1" w:tplc="01F44A5C">
+    <w:lvl w:ilvl="1" w:tplc="8548C35C">
       <w:numFmt w:val="decimal"/>
       <w:lvlText w:val=""/>
       <w:lvlJc w:val="left"/>
     </w:lvl>
-    <w:lvl w:ilvl="2" w:tplc="3E221292">
+    <w:lvl w:ilvl="2" w:tplc="361653FE">
       <w:numFmt w:val="decimal"/>
       <w:lvlText w:val=""/>
       <w:lvlJc w:val="left"/>
     </w:lvl>
-    <w:lvl w:ilvl="3" w:tplc="B9104D74">
+    <w:lvl w:ilvl="3" w:tplc="9926C706">
       <w:numFmt w:val="decimal"/>
       <w:lvlText w:val=""/>
       <w:lvlJc w:val="left"/>
     </w:lvl>
-    <w:lvl w:ilvl="4" w:tplc="C14400BC">
+    <w:lvl w:ilvl="4" w:tplc="D6089874">
       <w:numFmt w:val="decimal"/>
       <w:lvlText w:val=""/>
       <w:lvlJc w:val="left"/>
     </w:lvl>
-    <w:lvl w:ilvl="5" w:tplc="9ABA3DBA">
+    <w:lvl w:ilvl="5" w:tplc="37E6E08C">
       <w:numFmt w:val="decimal"/>
       <w:lvlText w:val=""/>
       <w:lvlJc w:val="left"/>
     </w:lvl>
-    <w:lvl w:ilvl="6" w:tplc="5930DC10">
+    <w:lvl w:ilvl="6" w:tplc="F87EAD8E">
       <w:numFmt w:val="decimal"/>
       <w:lvlText w:val=""/>
       <w:lvlJc w:val="left"/>
     </w:lvl>
-    <w:lvl w:ilvl="7" w:tplc="D4AA39BE">
+    <w:lvl w:ilvl="7" w:tplc="AE9896F8">
       <w:numFmt w:val="decimal"/>
       <w:lvlText w:val=""/>
       <w:lvlJc w:val="left"/>
     </w:lvl>
-    <w:lvl w:ilvl="8" w:tplc="7AFECF5A">
+    <w:lvl w:ilvl="8" w:tplc="1594120A">
       <w:numFmt w:val="decimal"/>
       <w:lvlText w:val=""/>
       <w:lvlJc w:val="left"/>
     </w:lvl>
   </w:abstractNum>
-  <w:num w:numId="1" w16cid:durableId="1635519156">
-    <w:abstractNumId w:val="3"/>
+  <w:num w:numId="1" w16cid:durableId="1201555161">
+    <w:abstractNumId w:val="4"/>
     <w:lvlOverride w:ilvl="0">
       <w:startOverride w:val="1"/>
     </w:lvlOverride>
   </w:num>
-  <w:num w:numId="2" w16cid:durableId="1388140772">
-    <w:abstractNumId w:val="1"/>
+  <w:num w:numId="2" w16cid:durableId="2028942634">
+    <w:abstractNumId w:val="0"/>
     <w:lvlOverride w:ilvl="0">
       <w:startOverride w:val="1"/>
     </w:lvlOverride>

</xml_diff>